<commit_message>
QOL changes and report updates
</commit_message>
<xml_diff>
--- a/Week 6/CMP405 Tools Programming Report.docx
+++ b/Week 6/CMP405 Tools Programming Report.docx
@@ -297,6 +297,23 @@
         <w:t>G -&gt; un-focus and allow for free-movement</w:t>
       </w:r>
     </w:p>
+    <w:p>
+      <w:pPr>
+        <w:pStyle w:val="ListParagraph"/>
+      </w:pPr>
+    </w:p>
+    <w:p>
+      <w:pPr>
+        <w:pStyle w:val="ListParagraph"/>
+        <w:numPr>
+          <w:ilvl w:val="0"/>
+          <w:numId w:val="5"/>
+        </w:numPr>
+      </w:pPr>
+      <w:r>
+        <w:t xml:space="preserve">Hold right click and move mouse to turn camera </w:t>
+      </w:r>
+    </w:p>
     <w:p/>
     <w:p/>
     <w:p>
@@ -349,8 +366,6 @@
       <w:r>
         <w:t>Upon clicking this, the client will be prompted with four options:</w:t>
       </w:r>
-    </w:p>
-    <w:p>
       <w:r>
         <w:br w:type="page"/>
       </w:r>
@@ -374,7 +389,6 @@
         <w:pStyle w:val="Heading3"/>
       </w:pPr>
       <w:r>
-        <w:tab/>
         <w:t>Transform:</w:t>
       </w:r>
     </w:p>
@@ -385,14 +399,17 @@
     </w:p>
     <w:p>
       <w:pPr>
-        <w:ind w:left="360"/>
+        <w:spacing w:after="0"/>
       </w:pPr>
       <w:r>
         <w:t>When this mode has been selected, after selecting an in-scene object via the mouse picking mechanic, use the following:</w:t>
       </w:r>
-      <w:r>
-        <w:br/>
-      </w:r>
+    </w:p>
+    <w:p>
+      <w:pPr>
+        <w:spacing w:after="0"/>
+        <w:ind w:left="720"/>
+      </w:pPr>
       <w:r>
         <w:br/>
         <w:t>W –&gt; to move object forward</w:t>
@@ -408,7 +425,8 @@
     </w:p>
     <w:p>
       <w:pPr>
-        <w:ind w:left="360"/>
+        <w:spacing w:after="0"/>
+        <w:ind w:left="720"/>
       </w:pPr>
       <w:r>
         <w:t>D –&gt; to move object right</w:t>
@@ -422,7 +440,6 @@
     <w:p>
       <w:pPr>
         <w:pStyle w:val="Heading3"/>
-        <w:ind w:firstLine="360"/>
       </w:pPr>
       <w:r>
         <w:t>Rotate:</w:t>
@@ -439,12 +456,53 @@
       </w:r>
     </w:p>
     <w:p/>
+    <w:p>
+      <w:pPr>
+        <w:spacing w:after="0"/>
+        <w:ind w:left="720"/>
+      </w:pPr>
+      <w:r>
+        <w:t>W -&gt; rotate forwards</w:t>
+      </w:r>
+    </w:p>
+    <w:p>
+      <w:pPr>
+        <w:spacing w:after="0"/>
+        <w:ind w:left="720"/>
+      </w:pPr>
+      <w:r>
+        <w:t>S -&gt; rotate backwards</w:t>
+      </w:r>
+    </w:p>
+    <w:p>
+      <w:pPr>
+        <w:spacing w:after="0"/>
+        <w:ind w:left="720"/>
+      </w:pPr>
+      <w:r>
+        <w:t>A -&gt; rotate left</w:t>
+      </w:r>
+    </w:p>
+    <w:p>
+      <w:pPr>
+        <w:spacing w:after="0"/>
+        <w:ind w:left="720"/>
+      </w:pPr>
+      <w:r>
+        <w:t>D -&gt; rotate right</w:t>
+      </w:r>
+    </w:p>
     <w:p/>
     <w:p>
       <w:pPr>
         <w:pStyle w:val="Heading3"/>
         <w:ind w:firstLine="720"/>
       </w:pPr>
+    </w:p>
+    <w:p>
+      <w:pPr>
+        <w:pStyle w:val="Heading3"/>
+      </w:pPr>
       <w:r>
         <w:t>Scale:</w:t>
       </w:r>
@@ -460,8 +518,48 @@
       </w:r>
     </w:p>
     <w:p/>
-    <w:p/>
-    <w:p/>
+    <w:p>
+      <w:pPr>
+        <w:spacing w:after="0"/>
+        <w:ind w:left="720"/>
+      </w:pPr>
+      <w:r>
+        <w:t>W -&gt; increase scale on z axis</w:t>
+      </w:r>
+    </w:p>
+    <w:p>
+      <w:pPr>
+        <w:spacing w:after="0"/>
+        <w:ind w:left="720"/>
+      </w:pPr>
+      <w:r>
+        <w:t>S -&gt; decrease scale on z axis</w:t>
+      </w:r>
+    </w:p>
+    <w:p>
+      <w:pPr>
+        <w:spacing w:after="0"/>
+        <w:ind w:left="720"/>
+      </w:pPr>
+    </w:p>
+    <w:p>
+      <w:pPr>
+        <w:spacing w:after="0"/>
+        <w:ind w:left="720"/>
+      </w:pPr>
+      <w:r>
+        <w:t>D -&gt; increase scale on x axis</w:t>
+      </w:r>
+    </w:p>
+    <w:p>
+      <w:pPr>
+        <w:spacing w:after="0"/>
+        <w:ind w:left="720"/>
+      </w:pPr>
+      <w:r>
+        <w:t>A -&gt; decrease scale on x axis</w:t>
+      </w:r>
+    </w:p>
     <w:p>
       <w:r>
         <w:br w:type="page"/>
@@ -586,6 +684,138 @@
       </w:r>
       <w:r>
         <w:t xml:space="preserve"> UI.</w:t>
+      </w:r>
+    </w:p>
+    <w:p/>
+    <w:p>
+      <w:r>
+        <w:br w:type="page"/>
+      </w:r>
+    </w:p>
+    <w:p>
+      <w:pPr>
+        <w:pStyle w:val="Heading2"/>
+      </w:pPr>
+      <w:r>
+        <w:lastRenderedPageBreak/>
+        <w:t>Camera:</w:t>
+      </w:r>
+    </w:p>
+    <w:p>
+      <w:r>
+        <w:t>The camera is the client’s main form of navigation around the scene within the application. There is a single in-scene camera in which the user can manipulate using the discussed controls and is a key feature that should be utilised in order to have the best and smoothest UX possible.</w:t>
+      </w:r>
+      <w:r>
+        <w:t xml:space="preserve"> The aim was to mimic the functionality of controllable cameras in game engines such as Unity Engine.</w:t>
+      </w:r>
+    </w:p>
+    <w:p>
+      <w:r>
+        <w:t xml:space="preserve">Overall, the controllable camera feature is used and designed primarily as an aid to help the UX of other features such as the object transformation. </w:t>
+      </w:r>
+    </w:p>
+    <w:p>
+      <w:r>
+        <w:t xml:space="preserve">The camera movement is controlled via the Camera class, specifically, the MoveCam() method. This method simply takes the current position of the camera, applies the input direction and applies the speed where applicable. </w:t>
+      </w:r>
+    </w:p>
+    <w:p>
+      <w:r>
+        <w:t>A more detailed explanation as follows:</w:t>
+      </w:r>
+    </w:p>
+    <w:p>
+      <w:r>
+        <w:t xml:space="preserve">The first line within the method simply takes the cameras Vector3 and then takes a combination of the right and left inputs and this returns a value of either 1 or -1. From here, the camera movement speed is then multiplied by this returned value, which in turn, moves the camera is the desired direction. </w:t>
+      </w:r>
+    </w:p>
+    <w:p>
+      <w:r>
+        <w:t>The second line does the same process as the first line, however, this is applied to the look direction rather than the camera right.</w:t>
+      </w:r>
+    </w:p>
+    <w:p>
+      <w:r>
+        <w:t>The final line of code in the method does the same processes as the first line of code, however, is applied to the y axis rather than the x and z.</w:t>
+      </w:r>
+    </w:p>
+    <w:p>
+      <w:r>
+        <w:drawing>
+          <wp:anchor distT="0" distB="0" distL="114300" distR="114300" simplePos="0" relativeHeight="251661312" behindDoc="0" locked="0" layoutInCell="1" allowOverlap="1" wp14:anchorId="1D79C377" wp14:editId="44C61C55">
+            <wp:simplePos x="0" y="0"/>
+            <wp:positionH relativeFrom="column">
+              <wp:posOffset>419100</wp:posOffset>
+            </wp:positionH>
+            <wp:positionV relativeFrom="paragraph">
+              <wp:posOffset>10795</wp:posOffset>
+            </wp:positionV>
+            <wp:extent cx="4553585" cy="1238250"/>
+            <wp:effectExtent l="0" t="0" r="0" b="0"/>
+            <wp:wrapSquare wrapText="bothSides"/>
+            <wp:docPr id="1572628488" name="Picture 1" descr="A computer screen shot of white text&#10;&#10;AI-generated content may be incorrect."/>
+            <wp:cNvGraphicFramePr>
+              <a:graphicFrameLocks xmlns:a="http://schemas.openxmlformats.org/drawingml/2006/main" noChangeAspect="1"/>
+            </wp:cNvGraphicFramePr>
+            <a:graphic xmlns:a="http://schemas.openxmlformats.org/drawingml/2006/main">
+              <a:graphicData uri="http://schemas.openxmlformats.org/drawingml/2006/picture">
+                <pic:pic xmlns:pic="http://schemas.openxmlformats.org/drawingml/2006/picture">
+                  <pic:nvPicPr>
+                    <pic:cNvPr id="1572628488" name="Picture 1" descr="A computer screen shot of white text&#10;&#10;AI-generated content may be incorrect."/>
+                    <pic:cNvPicPr/>
+                  </pic:nvPicPr>
+                  <pic:blipFill>
+                    <a:blip r:embed="rId6"/>
+                    <a:stretch>
+                      <a:fillRect/>
+                    </a:stretch>
+                  </pic:blipFill>
+                  <pic:spPr>
+                    <a:xfrm>
+                      <a:off x="0" y="0"/>
+                      <a:ext cx="4553585" cy="1238250"/>
+                    </a:xfrm>
+                    <a:prstGeom prst="rect">
+                      <a:avLst/>
+                    </a:prstGeom>
+                  </pic:spPr>
+                </pic:pic>
+              </a:graphicData>
+            </a:graphic>
+          </wp:anchor>
+        </w:drawing>
+      </w:r>
+    </w:p>
+    <w:p/>
+    <w:p/>
+    <w:p>
+      <w:pPr>
+        <w:pStyle w:val="Heading2"/>
+      </w:pPr>
+    </w:p>
+    <w:p>
+      <w:pPr>
+        <w:pStyle w:val="Heading2"/>
+      </w:pPr>
+    </w:p>
+    <w:p>
+      <w:pPr>
+        <w:pStyle w:val="Heading2"/>
+      </w:pPr>
+      <w:r>
+        <w:t>Focus Camera:</w:t>
+      </w:r>
+    </w:p>
+    <w:p>
+      <w:r>
+        <w:t>The camera focus is an additional mechanic added to the moveable camera feature of the application. This allows for the client to easily focus in on a selected object</w:t>
+      </w:r>
+      <w:r>
+        <w:t xml:space="preserve"> – allowing for the user to manipulate the objects with ease.</w:t>
+      </w:r>
+      <w:r>
+        <w:br/>
+        <w:t>This can be achieved by simply mouse picking the object of while holding the `f` key. This will zoom the client to the object, locking the camera. To unlock and gain access to the free cam, the client should simply click `g`.</w:t>
       </w:r>
     </w:p>
     <w:p/>
@@ -805,6 +1035,119 @@
     </w:lvl>
   </w:abstractNum>
   <w:abstractNum w:abstractNumId="2" w15:restartNumberingAfterBreak="0">
+    <w:nsid w:val="53C15BCE"/>
+    <w:multiLevelType w:val="hybridMultilevel"/>
+    <w:tmpl w:val="2E7839A6"/>
+    <w:lvl w:ilvl="0" w:tplc="08090001">
+      <w:start w:val="1"/>
+      <w:numFmt w:val="bullet"/>
+      <w:lvlText w:val=""/>
+      <w:lvlJc w:val="left"/>
+      <w:pPr>
+        <w:ind w:left="720" w:hanging="360"/>
+      </w:pPr>
+      <w:rPr>
+        <w:rFonts w:ascii="Symbol" w:hAnsi="Symbol" w:hint="default"/>
+      </w:rPr>
+    </w:lvl>
+    <w:lvl w:ilvl="1" w:tplc="FFFFFFFF">
+      <w:start w:val="1"/>
+      <w:numFmt w:val="bullet"/>
+      <w:lvlText w:val="o"/>
+      <w:lvlJc w:val="left"/>
+      <w:pPr>
+        <w:ind w:left="1440" w:hanging="360"/>
+      </w:pPr>
+      <w:rPr>
+        <w:rFonts w:ascii="Courier New" w:hAnsi="Courier New" w:cs="Courier New" w:hint="default"/>
+      </w:rPr>
+    </w:lvl>
+    <w:lvl w:ilvl="2" w:tplc="FFFFFFFF" w:tentative="1">
+      <w:start w:val="1"/>
+      <w:numFmt w:val="bullet"/>
+      <w:lvlText w:val=""/>
+      <w:lvlJc w:val="left"/>
+      <w:pPr>
+        <w:ind w:left="2160" w:hanging="360"/>
+      </w:pPr>
+      <w:rPr>
+        <w:rFonts w:ascii="Wingdings" w:hAnsi="Wingdings" w:hint="default"/>
+      </w:rPr>
+    </w:lvl>
+    <w:lvl w:ilvl="3" w:tplc="FFFFFFFF" w:tentative="1">
+      <w:start w:val="1"/>
+      <w:numFmt w:val="bullet"/>
+      <w:lvlText w:val=""/>
+      <w:lvlJc w:val="left"/>
+      <w:pPr>
+        <w:ind w:left="2880" w:hanging="360"/>
+      </w:pPr>
+      <w:rPr>
+        <w:rFonts w:ascii="Symbol" w:hAnsi="Symbol" w:hint="default"/>
+      </w:rPr>
+    </w:lvl>
+    <w:lvl w:ilvl="4" w:tplc="FFFFFFFF" w:tentative="1">
+      <w:start w:val="1"/>
+      <w:numFmt w:val="bullet"/>
+      <w:lvlText w:val="o"/>
+      <w:lvlJc w:val="left"/>
+      <w:pPr>
+        <w:ind w:left="3600" w:hanging="360"/>
+      </w:pPr>
+      <w:rPr>
+        <w:rFonts w:ascii="Courier New" w:hAnsi="Courier New" w:cs="Courier New" w:hint="default"/>
+      </w:rPr>
+    </w:lvl>
+    <w:lvl w:ilvl="5" w:tplc="FFFFFFFF" w:tentative="1">
+      <w:start w:val="1"/>
+      <w:numFmt w:val="bullet"/>
+      <w:lvlText w:val=""/>
+      <w:lvlJc w:val="left"/>
+      <w:pPr>
+        <w:ind w:left="4320" w:hanging="360"/>
+      </w:pPr>
+      <w:rPr>
+        <w:rFonts w:ascii="Wingdings" w:hAnsi="Wingdings" w:hint="default"/>
+      </w:rPr>
+    </w:lvl>
+    <w:lvl w:ilvl="6" w:tplc="FFFFFFFF" w:tentative="1">
+      <w:start w:val="1"/>
+      <w:numFmt w:val="bullet"/>
+      <w:lvlText w:val=""/>
+      <w:lvlJc w:val="left"/>
+      <w:pPr>
+        <w:ind w:left="5040" w:hanging="360"/>
+      </w:pPr>
+      <w:rPr>
+        <w:rFonts w:ascii="Symbol" w:hAnsi="Symbol" w:hint="default"/>
+      </w:rPr>
+    </w:lvl>
+    <w:lvl w:ilvl="7" w:tplc="FFFFFFFF" w:tentative="1">
+      <w:start w:val="1"/>
+      <w:numFmt w:val="bullet"/>
+      <w:lvlText w:val="o"/>
+      <w:lvlJc w:val="left"/>
+      <w:pPr>
+        <w:ind w:left="5760" w:hanging="360"/>
+      </w:pPr>
+      <w:rPr>
+        <w:rFonts w:ascii="Courier New" w:hAnsi="Courier New" w:cs="Courier New" w:hint="default"/>
+      </w:rPr>
+    </w:lvl>
+    <w:lvl w:ilvl="8" w:tplc="FFFFFFFF" w:tentative="1">
+      <w:start w:val="1"/>
+      <w:numFmt w:val="bullet"/>
+      <w:lvlText w:val=""/>
+      <w:lvlJc w:val="left"/>
+      <w:pPr>
+        <w:ind w:left="6480" w:hanging="360"/>
+      </w:pPr>
+      <w:rPr>
+        <w:rFonts w:ascii="Wingdings" w:hAnsi="Wingdings" w:hint="default"/>
+      </w:rPr>
+    </w:lvl>
+  </w:abstractNum>
+  <w:abstractNum w:abstractNumId="3" w15:restartNumberingAfterBreak="0">
     <w:nsid w:val="5DBB10C3"/>
     <w:multiLevelType w:val="hybridMultilevel"/>
     <w:tmpl w:val="6AE08C0E"/>
@@ -917,7 +1260,7 @@
       </w:rPr>
     </w:lvl>
   </w:abstractNum>
-  <w:abstractNum w:abstractNumId="3" w15:restartNumberingAfterBreak="0">
+  <w:abstractNum w:abstractNumId="4" w15:restartNumberingAfterBreak="0">
     <w:nsid w:val="6FAB3165"/>
     <w:multiLevelType w:val="hybridMultilevel"/>
     <w:tmpl w:val="1A3A96B6"/>
@@ -1034,13 +1377,16 @@
     <w:abstractNumId w:val="0"/>
   </w:num>
   <w:num w:numId="2" w16cid:durableId="510875336">
-    <w:abstractNumId w:val="3"/>
+    <w:abstractNumId w:val="4"/>
   </w:num>
   <w:num w:numId="3" w16cid:durableId="1221819956">
-    <w:abstractNumId w:val="2"/>
+    <w:abstractNumId w:val="3"/>
   </w:num>
   <w:num w:numId="4" w16cid:durableId="951740823">
     <w:abstractNumId w:val="1"/>
+  </w:num>
+  <w:num w:numId="5" w16cid:durableId="1179350057">
+    <w:abstractNumId w:val="2"/>
   </w:num>
 </w:numbering>
 </file>

</xml_diff>